<commit_message>
feat: added few new features
</commit_message>
<xml_diff>
--- a/deliverables/output/RIMSS - Build Strategy Document.docx
+++ b/deliverables/output/RIMSS - Build Strategy Document.docx
@@ -178,7 +178,7 @@
           </w:tcPr>
           <w:p>
             <w:r>
-              <w:t xml:space="preserve">2026-10-07</w:t>
+              <w:t xml:space="preserve">2026-10-14</w:t>
             </w:r>
           </w:p>
         </w:tc>
@@ -340,6 +340,32 @@
       </w:pPr>
       <w:r>
         <w:t xml:space="preserve">Mock Node.js/Express API server with static JSON backs frontend development in parallel with backend delivery.</w:t>
+      </w:r>
+    </w:p>
+    <w:p>
+      <w:pPr>
+        <w:pStyle w:val="ListParagraph"/>
+        <w:numPr>
+          <w:ilvl w:val="0"/>
+          <w:numId w:val="1"/>
+        </w:numPr>
+        <w:spacing w:after="60"/>
+      </w:pPr>
+      <w:r>
+        <w:t xml:space="preserve">Persistence and delivery: PostgreSQL with SQL migrations (JSON fallback locally), idempotent order creation, structured pino logging, and Docker/docker-compose images.</w:t>
+      </w:r>
+    </w:p>
+    <w:p>
+      <w:pPr>
+        <w:pStyle w:val="ListParagraph"/>
+        <w:numPr>
+          <w:ilvl w:val="0"/>
+          <w:numId w:val="1"/>
+        </w:numPr>
+        <w:spacing w:after="60"/>
+      </w:pPr>
+      <w:r>
+        <w:t xml:space="preserve">UX additions: SCSS design tokens with shared ui/ primitives, and a rule-based Chatbot assistant.</w:t>
       </w:r>
     </w:p>
     <w:p>

</xml_diff>

<commit_message>
feat: worked on some enhancements
</commit_message>
<xml_diff>
--- a/deliverables/output/RIMSS - Build Strategy Document.docx
+++ b/deliverables/output/RIMSS - Build Strategy Document.docx
@@ -178,7 +178,7 @@
           </w:tcPr>
           <w:p>
             <w:r>
-              <w:t xml:space="preserve">2026-10-20</w:t>
+              <w:t xml:space="preserve">2026-10-21</w:t>
             </w:r>
           </w:p>
         </w:tc>
@@ -460,7 +460,7 @@
         <w:spacing w:after="120"/>
       </w:pPr>
       <w:r>
-        <w:t xml:space="preserve">Effort per phase is detailed in the Estimation Sheet (about 1,100 person-hours in total); phases overlap where noted.</w:t>
+        <w:t xml:space="preserve">Effort per phase is detailed in the Estimation Sheet (about 1,100 person-hours manually, about 620 with AI-assisted delivery, a saving of roughly 45%, in line with published AI-coding productivity gains of 30 to 55%; the sheet also estimates token usage). Phases overlap where noted.</w:t>
       </w:r>
     </w:p>
     <w:tbl>

</xml_diff>